<commit_message>
update docs on Wed, Sep 30, 2026  02:04:53 PM
</commit_message>
<xml_diff>
--- a/Java/system_design.docx
+++ b/Java/system_design.docx
@@ -209,14 +209,7 @@
           <w:b/>
           <w:bCs/>
         </w:rPr>
-        <w:t>3)</w:t>
-      </w:r>
-      <w:r>
-        <w:rPr>
-          <w:b/>
-          <w:bCs/>
-        </w:rPr>
-        <w:t>Statement availability</w:t>
+        <w:t>3)Statement availability</w:t>
       </w:r>
     </w:p>
     <w:p>
@@ -362,17 +355,11 @@
           <w:b/>
           <w:bCs/>
         </w:rPr>
-        <w:t>2)</w:t>
-      </w:r>
-      <w:r>
-        <w:rPr>
-          <w:b/>
-          <w:bCs/>
-        </w:rPr>
-        <w:t>Performance</w:t>
-      </w:r>
-    </w:p>
-    <w:p>
+        <w:t>2)Performance</w:t>
+      </w:r>
+    </w:p>
+    <w:p>
+      <w:proofErr w:type="gramStart"/>
       <w:r>
         <w:rPr>
           <w:b/>
@@ -385,7 +372,15 @@
           <w:b/>
           <w:bCs/>
         </w:rPr>
-        <w:t xml:space="preserve"> : </w:t>
+        <w:t xml:space="preserve"> :</w:t>
+      </w:r>
+      <w:proofErr w:type="gramEnd"/>
+      <w:r>
+        <w:rPr>
+          <w:b/>
+          <w:bCs/>
+        </w:rPr>
+        <w:t xml:space="preserve"> </w:t>
       </w:r>
       <w:r>
         <w:t xml:space="preserve">All previous-month statements should be generated within </w:t>
@@ -397,8 +392,29 @@
         <w:t>4 hours on day 1</w:t>
       </w:r>
       <w:r>
-        <w:t xml:space="preserve"> ( 00 : 00 to 23 : 59 )</w:t>
-      </w:r>
+        <w:t xml:space="preserve"> </w:t>
+      </w:r>
+      <w:proofErr w:type="gramStart"/>
+      <w:r>
+        <w:t>( 00</w:t>
+      </w:r>
+      <w:proofErr w:type="gramEnd"/>
+      <w:r>
+        <w:t xml:space="preserve"> : 00 to </w:t>
+      </w:r>
+      <w:proofErr w:type="gramStart"/>
+      <w:r>
+        <w:t>23 :</w:t>
+      </w:r>
+      <w:proofErr w:type="gramEnd"/>
+      <w:r>
+        <w:t xml:space="preserve"> </w:t>
+      </w:r>
+      <w:proofErr w:type="gramStart"/>
+      <w:r>
+        <w:t>59 )</w:t>
+      </w:r>
+      <w:proofErr w:type="gramEnd"/>
     </w:p>
     <w:p>
       <w:r>
@@ -509,6 +525,7 @@
         </w:rPr>
         <w:t xml:space="preserve"> </w:t>
       </w:r>
+      <w:proofErr w:type="gramStart"/>
       <w:r>
         <w:rPr>
           <w:b/>
@@ -516,13 +533,23 @@
         </w:rPr>
         <w:t>( Failure</w:t>
       </w:r>
-      <w:r>
-        <w:rPr>
-          <w:b/>
-          <w:bCs/>
-        </w:rPr>
-        <w:t xml:space="preserve"> handling )</w:t>
-      </w:r>
+      <w:proofErr w:type="gramEnd"/>
+      <w:r>
+        <w:rPr>
+          <w:b/>
+          <w:bCs/>
+        </w:rPr>
+        <w:t xml:space="preserve"> </w:t>
+      </w:r>
+      <w:proofErr w:type="gramStart"/>
+      <w:r>
+        <w:rPr>
+          <w:b/>
+          <w:bCs/>
+        </w:rPr>
+        <w:t>handling )</w:t>
+      </w:r>
+      <w:proofErr w:type="gramEnd"/>
     </w:p>
     <w:p>
       <w:r>
@@ -818,14 +845,27 @@
         <w:t xml:space="preserve"> are independent</w:t>
       </w:r>
       <w:r>
-        <w:t xml:space="preserve"> ( </w:t>
-      </w:r>
-      <w:r>
-        <w:t>discrete, non-overlapping</w:t>
-      </w:r>
-      <w:r>
-        <w:t xml:space="preserve"> dataset ranges )</w:t>
-      </w:r>
+        <w:t xml:space="preserve"> </w:t>
+      </w:r>
+      <w:proofErr w:type="gramStart"/>
+      <w:r>
+        <w:t xml:space="preserve">( </w:t>
+      </w:r>
+      <w:r>
+        <w:t>discrete</w:t>
+      </w:r>
+      <w:proofErr w:type="gramEnd"/>
+      <w:r>
+        <w:t>, non-overlapping</w:t>
+      </w:r>
+      <w:r>
+        <w:t xml:space="preserve"> dataset </w:t>
+      </w:r>
+      <w:proofErr w:type="gramStart"/>
+      <w:r>
+        <w:t>ranges )</w:t>
+      </w:r>
+      <w:proofErr w:type="gramEnd"/>
       <w:r>
         <w:t xml:space="preserve"> execution units that execute a subset of the total workload</w:t>
       </w:r>
@@ -921,9 +961,19 @@
       <w:r>
         <w:t xml:space="preserve"> Partitioner </w:t>
       </w:r>
-      <w:r>
-        <w:t>( work load partition not database partition )</w:t>
-      </w:r>
+      <w:proofErr w:type="gramStart"/>
+      <w:r>
+        <w:t>( work</w:t>
+      </w:r>
+      <w:proofErr w:type="gramEnd"/>
+      <w:r>
+        <w:t xml:space="preserve"> load partition not database </w:t>
+      </w:r>
+      <w:proofErr w:type="gramStart"/>
+      <w:r>
+        <w:t>partition )</w:t>
+      </w:r>
+      <w:proofErr w:type="gramEnd"/>
     </w:p>
     <w:p>
       <w:pPr>
@@ -1030,8 +1080,13 @@
       </w:r>
     </w:p>
     <w:p>
-      <w:r>
-        <w:t>So it is essentially:</w:t>
+      <w:proofErr w:type="gramStart"/>
+      <w:r>
+        <w:t>So</w:t>
+      </w:r>
+      <w:proofErr w:type="gramEnd"/>
+      <w:r>
+        <w:t xml:space="preserve"> it is essentially:</w:t>
       </w:r>
     </w:p>
     <w:p>
@@ -1183,14 +1238,7 @@
           <w:b/>
           <w:bCs/>
         </w:rPr>
-        <w:t xml:space="preserve">DB </w:t>
-      </w:r>
-      <w:r>
-        <w:rPr>
-          <w:b/>
-          <w:bCs/>
-        </w:rPr>
-        <w:t>partitioning</w:t>
+        <w:t>DB partitioning</w:t>
       </w:r>
     </w:p>
     <w:p>
@@ -1205,31 +1253,18 @@
     </w:p>
     <w:p>
       <w:r>
-        <w:t xml:space="preserve">If we partition by the account number in </w:t>
-      </w:r>
-      <w:r>
-        <w:t>database,</w:t>
-      </w:r>
-      <w:r>
-        <w:t xml:space="preserve"> then it would be easy as statement naturally belongs to one customer.</w:t>
-      </w:r>
-    </w:p>
-    <w:p>
-      <w:r>
-        <w:t xml:space="preserve">For this do we need to know the all the customer account numbers </w:t>
-      </w:r>
-      <w:r>
-        <w:t>beforehand</w:t>
-      </w:r>
-      <w:r>
-        <w:t xml:space="preserve"> to form a </w:t>
-      </w:r>
-      <w:r>
-        <w:t>partition</w:t>
-      </w:r>
-      <w:r>
-        <w:t xml:space="preserve"> ?</w:t>
-      </w:r>
+        <w:t>If we partition by the account number in database, then it would be easy as statement naturally belongs to one customer.</w:t>
+      </w:r>
+    </w:p>
+    <w:p>
+      <w:r>
+        <w:t xml:space="preserve">For this do we need to know the all the customer account numbers beforehand to form a </w:t>
+      </w:r>
+      <w:proofErr w:type="gramStart"/>
+      <w:r>
+        <w:t>partition ?</w:t>
+      </w:r>
+      <w:proofErr w:type="gramEnd"/>
     </w:p>
     <w:p>
       <w:r>
@@ -1245,10 +1280,7 @@
     <w:p>
       <w:r>
         <w:lastRenderedPageBreak/>
-        <w:t>Trade-off</w:t>
-      </w:r>
-      <w:r>
-        <w:t>: Some customers may have vastly more transactions than others, causing uneven workload during batch processing.</w:t>
+        <w:t>Trade-off: Some customers may have vastly more transactions than others, causing uneven workload during batch processing.</w:t>
       </w:r>
     </w:p>
     <w:p>
@@ -1281,8 +1313,21 @@
         <w:t xml:space="preserve"> Different account numbers are not guaranteed to be isolated into different partitions.</w:t>
       </w:r>
       <w:r>
-        <w:t xml:space="preserve"> ( hash collision )</w:t>
-      </w:r>
+        <w:t xml:space="preserve"> </w:t>
+      </w:r>
+      <w:proofErr w:type="gramStart"/>
+      <w:r>
+        <w:t>( hash</w:t>
+      </w:r>
+      <w:proofErr w:type="gramEnd"/>
+      <w:r>
+        <w:t xml:space="preserve"> </w:t>
+      </w:r>
+      <w:proofErr w:type="gramStart"/>
+      <w:r>
+        <w:t>collision )</w:t>
+      </w:r>
+      <w:proofErr w:type="gramEnd"/>
     </w:p>
     <w:p>
       <w:r>
@@ -1291,6 +1336,161 @@
     </w:p>
     <w:p/>
     <w:p>
+      <w:r>
+        <w:t xml:space="preserve">DDL </w:t>
+      </w:r>
+    </w:p>
+    <w:p>
+      <w:r>
+        <w:t xml:space="preserve">CREATE TABLE </w:t>
+      </w:r>
+      <w:proofErr w:type="spellStart"/>
+      <w:r>
+        <w:t>customer_transaction</w:t>
+      </w:r>
+      <w:proofErr w:type="spellEnd"/>
+      <w:r>
+        <w:t xml:space="preserve"> (</w:t>
+      </w:r>
+    </w:p>
+    <w:p>
+      <w:r>
+        <w:t xml:space="preserve">    </w:t>
+      </w:r>
+      <w:proofErr w:type="spellStart"/>
+      <w:r>
+        <w:t>transaction_id</w:t>
+      </w:r>
+      <w:proofErr w:type="spellEnd"/>
+      <w:r>
+        <w:t xml:space="preserve"> BIGINT NOT NULL,</w:t>
+      </w:r>
+    </w:p>
+    <w:p>
+      <w:r>
+        <w:t xml:space="preserve">    </w:t>
+      </w:r>
+      <w:proofErr w:type="spellStart"/>
+      <w:r>
+        <w:t>account_number</w:t>
+      </w:r>
+      <w:proofErr w:type="spellEnd"/>
+      <w:r>
+        <w:t xml:space="preserve"> BIGINT NOT NULL,</w:t>
+      </w:r>
+    </w:p>
+    <w:p>
+      <w:r>
+        <w:t xml:space="preserve">    </w:t>
+      </w:r>
+      <w:proofErr w:type="spellStart"/>
+      <w:r>
+        <w:t>transaction_date</w:t>
+      </w:r>
+      <w:proofErr w:type="spellEnd"/>
+      <w:r>
+        <w:t xml:space="preserve"> DATETIME NOT NULL,</w:t>
+      </w:r>
+    </w:p>
+    <w:p>
+      <w:r>
+        <w:t xml:space="preserve">    </w:t>
+      </w:r>
+      <w:proofErr w:type="spellStart"/>
+      <w:r>
+        <w:t>transaction_type</w:t>
+      </w:r>
+      <w:proofErr w:type="spellEnd"/>
+      <w:r>
+        <w:t xml:space="preserve"> </w:t>
+      </w:r>
+      <w:proofErr w:type="gramStart"/>
+      <w:r>
+        <w:t>VARCHAR(</w:t>
+      </w:r>
+      <w:proofErr w:type="gramEnd"/>
+      <w:r>
+        <w:t>20),</w:t>
+      </w:r>
+    </w:p>
+    <w:p>
+      <w:r>
+        <w:t xml:space="preserve">    debit </w:t>
+      </w:r>
+      <w:proofErr w:type="gramStart"/>
+      <w:r>
+        <w:t>DECIMAL(</w:t>
+      </w:r>
+      <w:proofErr w:type="gramEnd"/>
+      <w:r>
+        <w:t>15,2),</w:t>
+      </w:r>
+    </w:p>
+    <w:p>
+      <w:r>
+        <w:t xml:space="preserve">    credit </w:t>
+      </w:r>
+      <w:proofErr w:type="gramStart"/>
+      <w:r>
+        <w:t>DECIMAL(</w:t>
+      </w:r>
+      <w:proofErr w:type="gramEnd"/>
+      <w:r>
+        <w:t>15,2),</w:t>
+      </w:r>
+    </w:p>
+    <w:p/>
+    <w:p>
+      <w:r>
+        <w:t xml:space="preserve">    PRIMARY KEY (</w:t>
+      </w:r>
+      <w:proofErr w:type="spellStart"/>
+      <w:r>
+        <w:t>transaction_id</w:t>
+      </w:r>
+      <w:proofErr w:type="spellEnd"/>
+      <w:r>
+        <w:t xml:space="preserve">, </w:t>
+      </w:r>
+      <w:proofErr w:type="spellStart"/>
+      <w:r>
+        <w:t>account_number</w:t>
+      </w:r>
+      <w:proofErr w:type="spellEnd"/>
+      <w:r>
+        <w:t>)</w:t>
+      </w:r>
+    </w:p>
+    <w:p>
+      <w:r>
+        <w:t>)</w:t>
+      </w:r>
+    </w:p>
+    <w:p>
+      <w:r>
+        <w:t xml:space="preserve">PARTITION BY </w:t>
+      </w:r>
+      <w:proofErr w:type="gramStart"/>
+      <w:r>
+        <w:t>HASH(</w:t>
+      </w:r>
+      <w:proofErr w:type="spellStart"/>
+      <w:proofErr w:type="gramEnd"/>
+      <w:r>
+        <w:t>account_number</w:t>
+      </w:r>
+      <w:proofErr w:type="spellEnd"/>
+      <w:r>
+        <w:t>)</w:t>
+      </w:r>
+    </w:p>
+    <w:p>
+      <w:r>
+        <w:t>PARTITIONS 16;</w:t>
+      </w:r>
+    </w:p>
+    <w:p/>
+    <w:p>
       <w:pPr>
         <w:rPr>
           <w:b/>
@@ -1323,8 +1523,21 @@
         <w:t xml:space="preserve"> use one complete account as the processing unit</w:t>
       </w:r>
       <w:r>
-        <w:t xml:space="preserve"> ( worker process )</w:t>
-      </w:r>
+        <w:t xml:space="preserve"> </w:t>
+      </w:r>
+      <w:proofErr w:type="gramStart"/>
+      <w:r>
+        <w:t>( worker</w:t>
+      </w:r>
+      <w:proofErr w:type="gramEnd"/>
+      <w:r>
+        <w:t xml:space="preserve"> </w:t>
+      </w:r>
+      <w:proofErr w:type="gramStart"/>
+      <w:r>
+        <w:t>process )</w:t>
+      </w:r>
+      <w:proofErr w:type="gramEnd"/>
     </w:p>
     <w:p>
       <w:r>
@@ -1341,248 +1554,301 @@
       </w:r>
       <w:r>
         <w:t xml:space="preserve"> processing.</w:t>
-      </w:r>
-    </w:p>
-    <w:p>
-      <w:r>
-        <w:t>Worker</w:t>
-      </w:r>
-    </w:p>
-    <w:p>
-      <w:r>
-        <w:t xml:space="preserve">  </w:t>
-      </w:r>
-      <w:r>
-        <w:rPr>
-          <w:rFonts w:ascii="Times New Roman" w:hAnsi="Times New Roman" w:cs="Times New Roman"/>
-        </w:rPr>
-        <w:t>↓</w:t>
-      </w:r>
-    </w:p>
-    <w:p>
-      <w:r>
-        <w:t>Get one account</w:t>
-      </w:r>
-    </w:p>
-    <w:p>
-      <w:r>
-        <w:t xml:space="preserve">  </w:t>
-      </w:r>
-      <w:r>
-        <w:rPr>
-          <w:rFonts w:ascii="Times New Roman" w:hAnsi="Times New Roman" w:cs="Times New Roman"/>
-        </w:rPr>
-        <w:t>↓</w:t>
-      </w:r>
-    </w:p>
-    <w:p>
-      <w:r>
-        <w:t>Read ALL transactions for that account in chunks</w:t>
-      </w:r>
-    </w:p>
-    <w:p>
-      <w:r>
-        <w:t xml:space="preserve">  </w:t>
-      </w:r>
-      <w:r>
-        <w:rPr>
-          <w:rFonts w:ascii="Times New Roman" w:hAnsi="Times New Roman" w:cs="Times New Roman"/>
-        </w:rPr>
-        <w:t>↓</w:t>
-      </w:r>
-    </w:p>
-    <w:p>
-      <w:r>
-        <w:t>Generate statement</w:t>
-      </w:r>
-    </w:p>
-    <w:p>
-      <w:r>
-        <w:t xml:space="preserve">  </w:t>
-      </w:r>
-      <w:r>
-        <w:rPr>
-          <w:rFonts w:ascii="Times New Roman" w:hAnsi="Times New Roman" w:cs="Times New Roman"/>
-        </w:rPr>
-        <w:t>↓</w:t>
-      </w:r>
-    </w:p>
-    <w:p>
-      <w:r>
-        <w:t>Get next account</w:t>
-      </w:r>
-      <w:r>
-        <w:t xml:space="preserve"> ( from task queue )</w:t>
-      </w:r>
-    </w:p>
-    <w:p/>
-    <w:p>
-      <w:r>
-        <w:t xml:space="preserve">Then keyset pagination is applied </w:t>
-      </w:r>
-      <w:r>
-        <w:rPr>
-          <w:b/>
-          <w:bCs/>
-        </w:rPr>
-        <w:t>within that account</w:t>
-      </w:r>
-      <w:r>
-        <w:t>:</w:t>
-      </w:r>
-    </w:p>
-    <w:p>
-      <w:r>
-        <w:t>SELECT ...</w:t>
-      </w:r>
-    </w:p>
-    <w:p>
-      <w:r>
-        <w:t xml:space="preserve">FROM </w:t>
-      </w:r>
-      <w:proofErr w:type="spellStart"/>
-      <w:r>
-        <w:t>customer_transaction</w:t>
-      </w:r>
-      <w:proofErr w:type="spellEnd"/>
-    </w:p>
-    <w:p>
-      <w:r>
-        <w:t xml:space="preserve">WHERE </w:t>
-      </w:r>
-      <w:proofErr w:type="spellStart"/>
-      <w:r>
-        <w:t>account_number</w:t>
-      </w:r>
-      <w:proofErr w:type="spellEnd"/>
-      <w:r>
-        <w:t xml:space="preserve"> = ?</w:t>
-      </w:r>
-    </w:p>
-    <w:p>
-      <w:r>
-        <w:t xml:space="preserve">  AND </w:t>
-      </w:r>
-      <w:proofErr w:type="spellStart"/>
-      <w:r>
-        <w:t>transaction_id</w:t>
-      </w:r>
-      <w:proofErr w:type="spellEnd"/>
-      <w:r>
-        <w:t xml:space="preserve"> &gt; ?</w:t>
-      </w:r>
-    </w:p>
-    <w:p>
-      <w:r>
-        <w:t xml:space="preserve">ORDER BY </w:t>
-      </w:r>
-      <w:proofErr w:type="spellStart"/>
-      <w:r>
-        <w:t>transaction_id</w:t>
-      </w:r>
-      <w:proofErr w:type="spellEnd"/>
-    </w:p>
-    <w:p>
-      <w:r>
-        <w:t>LIMIT 5000;</w:t>
-      </w:r>
-    </w:p>
-    <w:p/>
-    <w:p>
-      <w:r>
-        <w:lastRenderedPageBreak/>
-        <w:t>Account A</w:t>
-      </w:r>
-    </w:p>
-    <w:p>
-      <w:r>
-        <w:t xml:space="preserve"> </w:t>
-      </w:r>
-      <w:r>
-        <w:rPr>
-          <w:rFonts w:ascii="MS Mincho" w:eastAsia="MS Mincho" w:hAnsi="MS Mincho" w:cs="MS Mincho" w:hint="eastAsia"/>
-        </w:rPr>
-        <w:t>├──</w:t>
-      </w:r>
-      <w:r>
-        <w:t xml:space="preserve"> Chunk 1 </w:t>
-      </w:r>
-      <w:r>
-        <w:rPr>
-          <w:rFonts w:ascii="Times New Roman" w:hAnsi="Times New Roman" w:cs="Times New Roman"/>
-        </w:rPr>
-        <w:t>→</w:t>
-      </w:r>
-      <w:r>
-        <w:t xml:space="preserve"> 5,000 transactions</w:t>
-      </w:r>
-    </w:p>
-    <w:p>
-      <w:r>
-        <w:t xml:space="preserve"> </w:t>
-      </w:r>
-      <w:r>
-        <w:rPr>
-          <w:rFonts w:ascii="MS Mincho" w:eastAsia="MS Mincho" w:hAnsi="MS Mincho" w:cs="MS Mincho" w:hint="eastAsia"/>
-        </w:rPr>
-        <w:t>├──</w:t>
-      </w:r>
-      <w:r>
-        <w:t xml:space="preserve"> Chunk 2 </w:t>
-      </w:r>
-      <w:r>
-        <w:rPr>
-          <w:rFonts w:ascii="Times New Roman" w:hAnsi="Times New Roman" w:cs="Times New Roman"/>
-        </w:rPr>
-        <w:t>→</w:t>
-      </w:r>
-      <w:r>
-        <w:t xml:space="preserve"> 5,000 transactions</w:t>
-      </w:r>
-    </w:p>
-    <w:p>
-      <w:r>
-        <w:t xml:space="preserve"> </w:t>
-      </w:r>
-      <w:r>
-        <w:rPr>
-          <w:rFonts w:ascii="MS Mincho" w:eastAsia="MS Mincho" w:hAnsi="MS Mincho" w:cs="MS Mincho" w:hint="eastAsia"/>
-        </w:rPr>
-        <w:t>└──</w:t>
-      </w:r>
-      <w:r>
-        <w:t xml:space="preserve"> Chunk 3 </w:t>
-      </w:r>
-      <w:r>
-        <w:rPr>
-          <w:rFonts w:ascii="Times New Roman" w:hAnsi="Times New Roman" w:cs="Times New Roman"/>
-        </w:rPr>
-        <w:t>→</w:t>
-      </w:r>
-      <w:r>
-        <w:t xml:space="preserve"> remaining transactions</w:t>
-      </w:r>
-    </w:p>
-    <w:p>
-      <w:r>
-        <w:t xml:space="preserve">          </w:t>
-      </w:r>
-      <w:r>
-        <w:rPr>
-          <w:rFonts w:ascii="Times New Roman" w:hAnsi="Times New Roman" w:cs="Times New Roman"/>
-        </w:rPr>
-        <w:t>↓</w:t>
-      </w:r>
-    </w:p>
-    <w:p>
-      <w:r>
-        <w:t xml:space="preserve">      Statement A</w:t>
       </w:r>
     </w:p>
     <w:p/>
     <w:p/>
     <w:p/>
     <w:p/>
+    <w:p>
+      <w:r>
+        <w:lastRenderedPageBreak/>
+        <w:t>Worker</w:t>
+      </w:r>
+    </w:p>
+    <w:p>
+      <w:r>
+        <w:t xml:space="preserve">  </w:t>
+      </w:r>
+      <w:r>
+        <w:rPr>
+          <w:rFonts w:ascii="Times New Roman" w:hAnsi="Times New Roman" w:cs="Times New Roman"/>
+        </w:rPr>
+        <w:t>↓</w:t>
+      </w:r>
+    </w:p>
+    <w:p>
+      <w:r>
+        <w:t>Get one account</w:t>
+      </w:r>
+    </w:p>
+    <w:p>
+      <w:r>
+        <w:t xml:space="preserve">  </w:t>
+      </w:r>
+      <w:r>
+        <w:rPr>
+          <w:rFonts w:ascii="Times New Roman" w:hAnsi="Times New Roman" w:cs="Times New Roman"/>
+        </w:rPr>
+        <w:t>↓</w:t>
+      </w:r>
+    </w:p>
+    <w:p>
+      <w:r>
+        <w:t>Read ALL transactions for that account in chunks</w:t>
+      </w:r>
+    </w:p>
+    <w:p>
+      <w:r>
+        <w:t xml:space="preserve">  </w:t>
+      </w:r>
+      <w:r>
+        <w:rPr>
+          <w:rFonts w:ascii="Times New Roman" w:hAnsi="Times New Roman" w:cs="Times New Roman"/>
+        </w:rPr>
+        <w:t>↓</w:t>
+      </w:r>
+    </w:p>
+    <w:p>
+      <w:r>
+        <w:t>Generate statement</w:t>
+      </w:r>
+    </w:p>
+    <w:p>
+      <w:r>
+        <w:t xml:space="preserve">  </w:t>
+      </w:r>
+      <w:r>
+        <w:rPr>
+          <w:rFonts w:ascii="Times New Roman" w:hAnsi="Times New Roman" w:cs="Times New Roman"/>
+        </w:rPr>
+        <w:t>↓</w:t>
+      </w:r>
+    </w:p>
+    <w:p>
+      <w:r>
+        <w:t>Get next account</w:t>
+      </w:r>
+      <w:r>
+        <w:t xml:space="preserve"> </w:t>
+      </w:r>
+      <w:proofErr w:type="gramStart"/>
+      <w:r>
+        <w:t>( from</w:t>
+      </w:r>
+      <w:proofErr w:type="gramEnd"/>
+      <w:r>
+        <w:t xml:space="preserve"> task </w:t>
+      </w:r>
+      <w:proofErr w:type="gramStart"/>
+      <w:r>
+        <w:t>queue )</w:t>
+      </w:r>
+      <w:proofErr w:type="gramEnd"/>
+    </w:p>
+    <w:p/>
+    <w:p>
+      <w:r>
+        <w:t xml:space="preserve">Then keyset pagination is applied </w:t>
+      </w:r>
+      <w:r>
+        <w:rPr>
+          <w:b/>
+          <w:bCs/>
+        </w:rPr>
+        <w:t>within that account</w:t>
+      </w:r>
+      <w:r>
+        <w:t>:</w:t>
+      </w:r>
+    </w:p>
+    <w:p>
+      <w:r>
+        <w:t>SELECT ...</w:t>
+      </w:r>
+    </w:p>
+    <w:p>
+      <w:r>
+        <w:t xml:space="preserve">FROM </w:t>
+      </w:r>
+      <w:proofErr w:type="spellStart"/>
+      <w:r>
+        <w:t>customer_transaction</w:t>
+      </w:r>
+      <w:proofErr w:type="spellEnd"/>
+    </w:p>
+    <w:p>
+      <w:r>
+        <w:t xml:space="preserve">WHERE </w:t>
+      </w:r>
+      <w:proofErr w:type="spellStart"/>
+      <w:r>
+        <w:t>account_number</w:t>
+      </w:r>
+      <w:proofErr w:type="spellEnd"/>
+      <w:r>
+        <w:t xml:space="preserve"> </w:t>
+      </w:r>
+      <w:proofErr w:type="gramStart"/>
+      <w:r>
+        <w:t>= ?</w:t>
+      </w:r>
+      <w:proofErr w:type="gramEnd"/>
+    </w:p>
+    <w:p>
+      <w:r>
+        <w:t xml:space="preserve">  AND </w:t>
+      </w:r>
+      <w:proofErr w:type="spellStart"/>
+      <w:r>
+        <w:t>transaction_id</w:t>
+      </w:r>
+      <w:proofErr w:type="spellEnd"/>
+      <w:r>
+        <w:t xml:space="preserve"> </w:t>
+      </w:r>
+      <w:proofErr w:type="gramStart"/>
+      <w:r>
+        <w:t>&gt; ?</w:t>
+      </w:r>
+      <w:proofErr w:type="gramEnd"/>
+    </w:p>
+    <w:p>
+      <w:r>
+        <w:t xml:space="preserve">ORDER BY </w:t>
+      </w:r>
+      <w:proofErr w:type="spellStart"/>
+      <w:r>
+        <w:t>transaction_id</w:t>
+      </w:r>
+      <w:proofErr w:type="spellEnd"/>
+    </w:p>
+    <w:p>
+      <w:r>
+        <w:t>LIMIT 5000;</w:t>
+      </w:r>
+    </w:p>
+    <w:p/>
+    <w:p>
+      <w:r>
+        <w:t>Account A</w:t>
+      </w:r>
+    </w:p>
+    <w:p>
+      <w:r>
+        <w:t xml:space="preserve"> </w:t>
+      </w:r>
+      <w:r>
+        <w:rPr>
+          <w:rFonts w:ascii="MS Mincho" w:eastAsia="MS Mincho" w:hAnsi="MS Mincho" w:cs="MS Mincho" w:hint="eastAsia"/>
+        </w:rPr>
+        <w:t>├──</w:t>
+      </w:r>
+      <w:r>
+        <w:t xml:space="preserve"> Chunk 1 </w:t>
+      </w:r>
+      <w:r>
+        <w:rPr>
+          <w:rFonts w:ascii="Times New Roman" w:hAnsi="Times New Roman" w:cs="Times New Roman"/>
+        </w:rPr>
+        <w:t>→</w:t>
+      </w:r>
+      <w:r>
+        <w:t xml:space="preserve"> 5,000 transactions</w:t>
+      </w:r>
+    </w:p>
+    <w:p>
+      <w:r>
+        <w:t xml:space="preserve"> </w:t>
+      </w:r>
+      <w:r>
+        <w:rPr>
+          <w:rFonts w:ascii="MS Mincho" w:eastAsia="MS Mincho" w:hAnsi="MS Mincho" w:cs="MS Mincho" w:hint="eastAsia"/>
+        </w:rPr>
+        <w:t>├──</w:t>
+      </w:r>
+      <w:r>
+        <w:t xml:space="preserve"> Chunk 2 </w:t>
+      </w:r>
+      <w:r>
+        <w:rPr>
+          <w:rFonts w:ascii="Times New Roman" w:hAnsi="Times New Roman" w:cs="Times New Roman"/>
+        </w:rPr>
+        <w:t>→</w:t>
+      </w:r>
+      <w:r>
+        <w:t xml:space="preserve"> 5,000 transactions</w:t>
+      </w:r>
+    </w:p>
+    <w:p>
+      <w:r>
+        <w:t xml:space="preserve"> </w:t>
+      </w:r>
+      <w:r>
+        <w:rPr>
+          <w:rFonts w:ascii="MS Mincho" w:eastAsia="MS Mincho" w:hAnsi="MS Mincho" w:cs="MS Mincho" w:hint="eastAsia"/>
+        </w:rPr>
+        <w:t>└──</w:t>
+      </w:r>
+      <w:r>
+        <w:t xml:space="preserve"> Chunk 3 </w:t>
+      </w:r>
+      <w:r>
+        <w:rPr>
+          <w:rFonts w:ascii="Times New Roman" w:hAnsi="Times New Roman" w:cs="Times New Roman"/>
+        </w:rPr>
+        <w:t>→</w:t>
+      </w:r>
+      <w:r>
+        <w:t xml:space="preserve"> remaining transactions</w:t>
+      </w:r>
+    </w:p>
+    <w:p>
+      <w:r>
+        <w:t xml:space="preserve">          </w:t>
+      </w:r>
+      <w:r>
+        <w:rPr>
+          <w:rFonts w:ascii="Times New Roman" w:hAnsi="Times New Roman" w:cs="Times New Roman"/>
+        </w:rPr>
+        <w:t>↓</w:t>
+      </w:r>
+    </w:p>
+    <w:p>
+      <w:r>
+        <w:t xml:space="preserve">      Statement A</w:t>
+      </w:r>
+    </w:p>
+    <w:p/>
+    <w:p>
+      <w:proofErr w:type="gramStart"/>
+      <w:r>
+        <w:t>Here ,</w:t>
+      </w:r>
+      <w:proofErr w:type="gramEnd"/>
+      <w:r>
+        <w:t xml:space="preserve"> we can define the index for </w:t>
+      </w:r>
+      <w:r>
+        <w:t xml:space="preserve">the </w:t>
+      </w:r>
+      <w:proofErr w:type="spellStart"/>
+      <w:r>
+        <w:t>transaction_id</w:t>
+      </w:r>
+      <w:proofErr w:type="spellEnd"/>
+      <w:r>
+        <w:t xml:space="preserve"> for faster </w:t>
+      </w:r>
+      <w:proofErr w:type="gramStart"/>
+      <w:r>
+        <w:t>arrangement ,</w:t>
+      </w:r>
+      <w:proofErr w:type="gramEnd"/>
+      <w:r>
+        <w:t xml:space="preserve"> as this is being used in ORDER BY clause.</w:t>
+      </w:r>
+    </w:p>
     <w:p/>
     <w:p/>
     <w:sectPr>
@@ -3411,6 +3677,7 @@
   <w:style w:type="character" w:default="1" w:styleId="DefaultParagraphFont">
     <w:name w:val="Default Paragraph Font"/>
     <w:uiPriority w:val="1"/>
+    <w:semiHidden/>
     <w:unhideWhenUsed/>
   </w:style>
   <w:style w:type="table" w:default="1" w:styleId="TableNormal">

</xml_diff>